<commit_message>
Configure cloud deployment for Render and Vercel
</commit_message>
<xml_diff>
--- a/backend/app/uploads/edited/ClauseGuard_Sample_High_Risk_Service_Agreement_REVISED_SAFE.docx
+++ b/backend/app/uploads/edited/ClauseGuard_Sample_High_Risk_Service_Agreement_REVISED_SAFE.docx
@@ -145,7 +145,7 @@
                 <w:color w:val="0A192F"/>
                 <w:sz w:val="19"/>
               </w:rPr>
-              <w:t>KIIN65FC4ARYGKLOBGYFDVUFEFVNOMJTS6E43LMWIOPQVF3PYK7Q</w:t>
+              <w:t>YABHFGTCEAZNMCODA4QR4K7IVEV2F2NTCO2PEBGHWHJ6Z6KLPCVA</w:t>
             </w:r>
           </w:p>
         </w:tc>
@@ -207,7 +207,7 @@
           <w:color w:val="212529"/>
           <w:sz w:val="21"/>
         </w:rPr>
-        <w:t>The proposed Service Agreement poses an extremely high legal and financial risk profile for the Client. It features severe asymmetrical terms, including complete disclaimer of liability by the Company, unlimited unilateral indemnification imposed on the Client, impossible auto-renewal notice terms, extreme 10-year worldwide non-compete restrictions, immediate termination without cause for the Company, and complete unilateral control over governing law and dispute resolution venues.</w:t>
+        <w:t>This Agreement presents an extraordinarily high risk profile for the Client. It contains severe, one-sided provisions favoring the Company, including immediate unilateral termination rights, uncapped client indemnification, total disclaimer of Company liability, broad IP assignment of Client assets, an impossible 365-day auto-renewal cancellation requirement, an unenforceable 10-year worldwide non-compete, and unilateral control over dispute forums and governing law. Rejection or substantial renegotiation of these terms is strongly advised.</w:t>
       </w:r>
     </w:p>
     <w:p/>
@@ -258,7 +258,7 @@
         <w:rPr>
           <w:sz w:val="19"/>
         </w:rPr>
-        <w:t>Grants the Company sole authority to select dispute venues and governing law while stripping the Client of legal rights to challenge forum selection.</w:t>
+        <w:t>Grants the Company complete unilateral authority to choose the arbitration venue without allowing the Client to challenge unfair locations.</w:t>
       </w:r>
     </w:p>
     <w:p>
@@ -294,7 +294,7 @@
                 <w:color w:val="F8F9FA"/>
                 <w:sz w:val="20"/>
               </w:rPr>
-              <w:t>"Any dispute arising under this Agreement shall be resolved by binding arbitration in [Mutually Agreed Location] under the rules of the American Arbitration Association, and governed by the laws of [Mutually Agreed Jurisdiction]."</w:t>
+              <w:t>"Any dispute arising under this Agreement shall be resolved by binding arbitration in a mutually agreed neutral location under the commercial arbitration rules of the American Arbitration Association."</w:t>
             </w:r>
           </w:p>
         </w:tc>
@@ -327,7 +327,7 @@
           <w:rFonts w:ascii="Georgia" w:hAnsi="Georgia"/>
           <w:color w:val="C5A059"/>
         </w:rPr>
-        <w:t>SECTION #2: AUTO-RENEWAL [HIGH RISK]</w:t>
+        <w:t>SECTION #2: ARBITRATION &amp; GOVERNING LAW [HIGH RISK]</w:t>
       </w:r>
     </w:p>
     <w:p>
@@ -343,7 +343,7 @@
         <w:rPr>
           <w:sz w:val="19"/>
         </w:rPr>
-        <w:t>Requiring 365 days' advance written notice to prevent auto-renewal effectively locks the Client in upon execution.</w:t>
+        <w:t>Allows the Company to arbitrarily decide governing law at its sole discretion, creating significant legal unpredictability for the Client.</w:t>
       </w:r>
     </w:p>
     <w:p>
@@ -379,7 +379,7 @@
                 <w:color w:val="F8F9FA"/>
                 <w:sz w:val="20"/>
               </w:rPr>
-              <w:t>"This Agreement shall automatically renew for successive 12-month terms unless either party gives written notice of non-renewal at least thirty (30) days prior to the expiration of the current term."</w:t>
+              <w:t>"This Agreement shall be governed by and construed in accordance with the laws of [Insert Designated Jurisdiction], without giving effect to conflict of law principles."</w:t>
             </w:r>
           </w:p>
         </w:tc>
@@ -399,7 +399,7 @@
           <w:i/>
           <w:sz w:val="18"/>
         </w:rPr>
-        <w:t>"This Agreement shall automatically renew every 12 months unless the Client provides written notice at least 365 days before expiration."</w:t>
+        <w:t>"This Agreement shall be governed by the laws chosen solely by the Company at its discretion."</w:t>
       </w:r>
     </w:p>
     <w:p/>
@@ -412,7 +412,7 @@
           <w:rFonts w:ascii="Georgia" w:hAnsi="Georgia"/>
           <w:color w:val="C5A059"/>
         </w:rPr>
-        <w:t>SECTION #3: IP ASSIGNMENT [HIGH RISK]</w:t>
+        <w:t>SECTION #3: AUTO-RENEWAL [HIGH RISK]</w:t>
       </w:r>
     </w:p>
     <w:p>
@@ -428,7 +428,7 @@
         <w:rPr>
           <w:sz w:val="19"/>
         </w:rPr>
-        <w:t>Improperly transfers all intellectual property created by the Client to the Company without compensation.</w:t>
+        <w:t>Requires a 365-day opt-out notice, effectively forcing automatic renewal immediately upon entering the agreement.</w:t>
       </w:r>
     </w:p>
     <w:p>
@@ -464,7 +464,7 @@
                 <w:color w:val="F8F9FA"/>
                 <w:sz w:val="20"/>
               </w:rPr>
-              <w:t>"Company acknowledges that Client retains full ownership of its pre-existing IP. Upon full payment of service fees, Company assigns to Client all right, title, and interest in and to the custom deliverables explicitly created for Client under this Agreement."</w:t>
+              <w:t>"This Agreement shall automatically renew for successive 12-month periods unless either party provides written notice of non-renewal at least thirty (30) days prior to the end of the current term."</w:t>
             </w:r>
           </w:p>
         </w:tc>
@@ -484,7 +484,7 @@
           <w:i/>
           <w:sz w:val="18"/>
         </w:rPr>
-        <w:t>"All intellectual property created by the Client during the engagement shall automatically become the sole property of the Company without additional compensation."</w:t>
+        <w:t>"This Agreement shall automatically renew every 12 months unless the Client provides written notice at least 365 days before expiration."</w:t>
       </w:r>
     </w:p>
     <w:p/>
@@ -495,9 +495,9 @@
       <w:r>
         <w:rPr>
           <w:rFonts w:ascii="Georgia" w:hAnsi="Georgia"/>
-          <w:color w:val="C5A059"/>
+          <w:color w:val="0A192F"/>
         </w:rPr>
-        <w:t>SECTION #4: INDEMNITY [HIGH RISK]</w:t>
+        <w:t>SECTION #4: CONFIDENTIALITY [MEDIUM RISK]</w:t>
       </w:r>
     </w:p>
     <w:p>
@@ -513,7 +513,7 @@
         <w:rPr>
           <w:sz w:val="19"/>
         </w:rPr>
-        <w:t>Imposes an uncapped, broad, and unilateral indemnification burden on the Client for any and all claims, regardless of fault or causation.</w:t>
+        <w:t>Imposes a non-mutual 25-year confidentiality obligation solely on the Client, which is excessively long for standard business communications.</w:t>
       </w:r>
     </w:p>
     <w:p>
@@ -549,7 +549,7 @@
                 <w:color w:val="F8F9FA"/>
                 <w:sz w:val="20"/>
               </w:rPr>
-              <w:t>"Each party agrees to indemnify, defend, and hold harmless the other party from and against third-party claims arising directly from the indemnifying party's gross negligence, willful misconduct, or material breach of this Agreement, subject to agreed liability caps."</w:t>
+              <w:t>"Both parties agree to protect confidential information disclosed under this Agreement for a period of three (3) years following termination."</w:t>
             </w:r>
           </w:p>
         </w:tc>
@@ -569,7 +569,7 @@
           <w:i/>
           <w:sz w:val="18"/>
         </w:rPr>
-        <w:t>"The Client agrees to indemnify and hold harmless the Company against any and all claims, damages, liabilities, losses, and expenses of every kind without limitation."</w:t>
+        <w:t>"The Client shall keep all Company information confidential for a period of 25 years after termination."</w:t>
       </w:r>
     </w:p>
     <w:p/>
@@ -582,7 +582,7 @@
           <w:rFonts w:ascii="Georgia" w:hAnsi="Georgia"/>
           <w:color w:val="C5A059"/>
         </w:rPr>
-        <w:t>SECTION #5: LIABILITY CAPS [HIGH RISK]</w:t>
+        <w:t>SECTION #5: IP ASSIGNMENT [HIGH RISK]</w:t>
       </w:r>
     </w:p>
     <w:p>
@@ -598,7 +598,7 @@
         <w:rPr>
           <w:sz w:val="19"/>
         </w:rPr>
-        <w:t>Completely waives all liability for the Company under any circumstance, including direct damages, rendering contractual remedies unenforceable against the Company.</w:t>
+        <w:t>Automatically transfers ownership of all intellectual property created by the Client during the engagement to the Company, potentially capturing the Client's pre-existing IP or unrelated work product.</w:t>
       </w:r>
     </w:p>
     <w:p>
@@ -634,7 +634,7 @@
                 <w:color w:val="F8F9FA"/>
                 <w:sz w:val="20"/>
               </w:rPr>
-              <w:t>"Except for breaches of confidentiality or gross negligence, neither party shall be liable for indirect, incidental, or consequential damages. Each party's aggregate liability under this Agreement shall be capped at the total amount of fees paid or payable by Client in the twelve (12) months preceding the claim."</w:t>
+              <w:t>"The Client retains all right, title, and interest in its pre-existing IP. Upon full payment of fees, the Client shall own all custom deliverables created specifically for the Client under this Agreement."</w:t>
             </w:r>
           </w:p>
         </w:tc>
@@ -654,7 +654,7 @@
           <w:i/>
           <w:sz w:val="18"/>
         </w:rPr>
-        <w:t>"The Company shall not be liable for any direct, indirect, incidental, consequential, punitive, or special damages under any circumstances."</w:t>
+        <w:t>"All intellectual property created by the Client during the engagement shall automatically become the sole property of the Company without additional compensation."</w:t>
       </w:r>
     </w:p>
     <w:p/>
@@ -667,7 +667,7 @@
           <w:rFonts w:ascii="Georgia" w:hAnsi="Georgia"/>
           <w:color w:val="C5A059"/>
         </w:rPr>
-        <w:t>SECTION #6: NON-COMPETE / NON-SOLICIT [HIGH RISK]</w:t>
+        <w:t>SECTION #6: INDEMNITY [HIGH RISK]</w:t>
       </w:r>
     </w:p>
     <w:p>
@@ -683,7 +683,7 @@
         <w:rPr>
           <w:sz w:val="19"/>
         </w:rPr>
-        <w:t>A 10-year global non-compete clause imposed on a client is oppressive, likely unenforceable in court, and severely restricts business operations.</w:t>
+        <w:t>Imposes broad, uncapped, and unilateral indemnification obligations solely on the Client for all claims and expenses, regardless of fault.</w:t>
       </w:r>
     </w:p>
     <w:p>
@@ -719,7 +719,7 @@
                 <w:color w:val="F8F9FA"/>
                 <w:sz w:val="20"/>
               </w:rPr>
-              <w:t>"Delete this clause entirely, or replace it with a standard, mutually agreed 1-year non-solicitation of key personnel."</w:t>
+              <w:t>"Each party agrees to indemnify and hold harmless the other party from third-party claims arising directly out of its gross negligence, willful misconduct, or material breach of this Agreement, subject to Section 6."</w:t>
             </w:r>
           </w:p>
         </w:tc>
@@ -739,7 +739,7 @@
           <w:i/>
           <w:sz w:val="18"/>
         </w:rPr>
-        <w:t>"The Client agrees not to engage in any competing business anywhere in the world for 10 years after this Agreement ends."</w:t>
+        <w:t>"The Client agrees to indemnify and hold harmless the Company against any and all claims, damages, liabilities, losses, and expenses of every kind without limitation."</w:t>
       </w:r>
     </w:p>
     <w:p/>
@@ -752,7 +752,7 @@
           <w:rFonts w:ascii="Georgia" w:hAnsi="Georgia"/>
           <w:color w:val="C5A059"/>
         </w:rPr>
-        <w:t>SECTION #7: TERMINATION TERMS [HIGH RISK]</w:t>
+        <w:t>SECTION #7: LIABILITY CAPS [HIGH RISK]</w:t>
       </w:r>
     </w:p>
     <w:p>
@@ -768,7 +768,7 @@
         <w:rPr>
           <w:sz w:val="19"/>
         </w:rPr>
-        <w:t>Allows the Company to terminate immediately without notice or cause, creating severe business operational risk for the Client while offering no reciprocal termination rights.</w:t>
+        <w:t>Completely disclaims all Company liability (including direct damages), shifting 100% of the operational and financial risk to the Client.</w:t>
       </w:r>
     </w:p>
     <w:p>
@@ -804,7 +804,177 @@
                 <w:color w:val="F8F9FA"/>
                 <w:sz w:val="20"/>
               </w:rPr>
-              <w:t>"Either party may terminate this Agreement for convenience upon thirty (30) days' prior written notice to the other party, or immediately upon written notice in the event of a material breach that remains uncured for fifteen (15) days."</w:t>
+              <w:t>"Except for indemnification obligations or breaches of confidentiality, neither party's total aggregate liability shall exceed the total service fees paid by Client under this Agreement in the 12 months preceding the claim."</w:t>
+            </w:r>
+          </w:p>
+        </w:tc>
+      </w:tr>
+    </w:tbl>
+    <w:p>
+      <w:r>
+        <w:rPr>
+          <w:b/>
+          <w:color w:val="646464"/>
+          <w:sz w:val="18"/>
+        </w:rPr>
+        <w:t xml:space="preserve">Superseded Original Contract Text: </w:t>
+      </w:r>
+      <w:r>
+        <w:rPr>
+          <w:i/>
+          <w:sz w:val="18"/>
+        </w:rPr>
+        <w:t>"The Company shall not be liable for any direct, indirect, incidental, consequential, punitive, or special damages under any circumstances."</w:t>
+      </w:r>
+    </w:p>
+    <w:p/>
+    <w:p>
+      <w:pPr>
+        <w:pStyle w:val="Heading2"/>
+      </w:pPr>
+      <w:r>
+        <w:rPr>
+          <w:rFonts w:ascii="Georgia" w:hAnsi="Georgia"/>
+          <w:color w:val="C5A059"/>
+        </w:rPr>
+        <w:t>SECTION #8: NON-COMPETE / NON-SOLICIT [HIGH RISK]</w:t>
+      </w:r>
+    </w:p>
+    <w:p>
+      <w:r>
+        <w:rPr>
+          <w:b/>
+          <w:color w:val="B42828"/>
+          <w:sz w:val="19"/>
+        </w:rPr>
+        <w:t xml:space="preserve">WHY THIS IS CONSIDERED A RISK (VULNERABILITY): </w:t>
+      </w:r>
+      <w:r>
+        <w:rPr>
+          <w:sz w:val="19"/>
+        </w:rPr>
+        <w:t>Enforces a 10-year worldwide restriction on the Client competing with the Company, which is unreasonable in scope, duration, and geographic reach.</w:t>
+      </w:r>
+    </w:p>
+    <w:p>
+      <w:r>
+        <w:rPr>
+          <w:b/>
+          <w:color w:val="0A192F"/>
+          <w:sz w:val="20"/>
+        </w:rPr>
+        <w:t>ALTERNATIVE WAY TO OVERCOME (APPLIED REWORDED CLAUSE):</w:t>
+      </w:r>
+    </w:p>
+    <w:tbl>
+      <w:tblPr>
+        <w:tblW w:type="auto" w:w="0"/>
+        <w:jc w:val="center"/>
+        <w:tblLook w:firstColumn="1" w:firstRow="1" w:lastColumn="0" w:lastRow="0" w:noHBand="0" w:noVBand="1" w:val="04A0"/>
+      </w:tblPr>
+      <w:tblGrid>
+        <w:gridCol w:w="9936"/>
+      </w:tblGrid>
+      <w:tr>
+        <w:tc>
+          <w:tcPr>
+            <w:tcW w:type="dxa" w:w="9648"/>
+            <w:shd w:val="clear" w:color="auto" w:fill="0A192F"/>
+          </w:tcPr>
+          <w:p>
+            <w:r>
+              <w:rPr>
+                <w:rFonts w:ascii="Arial" w:hAnsi="Arial"/>
+                <w:b/>
+                <w:color w:val="F8F9FA"/>
+                <w:sz w:val="20"/>
+              </w:rPr>
+              <w:t>"Delete this section entirely, or limit it to a 1-year non-solicitation restriction of Company personnel involved in rendering the Services."</w:t>
+            </w:r>
+          </w:p>
+        </w:tc>
+      </w:tr>
+    </w:tbl>
+    <w:p>
+      <w:r>
+        <w:rPr>
+          <w:b/>
+          <w:color w:val="646464"/>
+          <w:sz w:val="18"/>
+        </w:rPr>
+        <w:t xml:space="preserve">Superseded Original Contract Text: </w:t>
+      </w:r>
+      <w:r>
+        <w:rPr>
+          <w:i/>
+          <w:sz w:val="18"/>
+        </w:rPr>
+        <w:t>"The Client agrees not to engage in any competing business anywhere in the world for 10 years after this Agreement ends."</w:t>
+      </w:r>
+    </w:p>
+    <w:p/>
+    <w:p>
+      <w:pPr>
+        <w:pStyle w:val="Heading2"/>
+      </w:pPr>
+      <w:r>
+        <w:rPr>
+          <w:rFonts w:ascii="Georgia" w:hAnsi="Georgia"/>
+          <w:color w:val="C5A059"/>
+        </w:rPr>
+        <w:t>SECTION #9: TERMINATION TERMS [HIGH RISK]</w:t>
+      </w:r>
+    </w:p>
+    <w:p>
+      <w:r>
+        <w:rPr>
+          <w:b/>
+          <w:color w:val="B42828"/>
+          <w:sz w:val="19"/>
+        </w:rPr>
+        <w:t xml:space="preserve">WHY THIS IS CONSIDERED A RISK (VULNERABILITY): </w:t>
+      </w:r>
+      <w:r>
+        <w:rPr>
+          <w:sz w:val="19"/>
+        </w:rPr>
+        <w:t>Allows the Company to terminate immediately without cause or notice, leaving the Client vulnerable to sudden disruption without recourse.</w:t>
+      </w:r>
+    </w:p>
+    <w:p>
+      <w:r>
+        <w:rPr>
+          <w:b/>
+          <w:color w:val="0A192F"/>
+          <w:sz w:val="20"/>
+        </w:rPr>
+        <w:t>ALTERNATIVE WAY TO OVERCOME (APPLIED REWORDED CLAUSE):</w:t>
+      </w:r>
+    </w:p>
+    <w:tbl>
+      <w:tblPr>
+        <w:tblW w:type="auto" w:w="0"/>
+        <w:jc w:val="center"/>
+        <w:tblLook w:firstColumn="1" w:firstRow="1" w:lastColumn="0" w:lastRow="0" w:noHBand="0" w:noVBand="1" w:val="04A0"/>
+      </w:tblPr>
+      <w:tblGrid>
+        <w:gridCol w:w="9936"/>
+      </w:tblGrid>
+      <w:tr>
+        <w:tc>
+          <w:tcPr>
+            <w:tcW w:type="dxa" w:w="9648"/>
+            <w:shd w:val="clear" w:color="auto" w:fill="0A192F"/>
+          </w:tcPr>
+          <w:p>
+            <w:r>
+              <w:rPr>
+                <w:rFonts w:ascii="Arial" w:hAnsi="Arial"/>
+                <w:b/>
+                <w:color w:val="F8F9FA"/>
+                <w:sz w:val="20"/>
+              </w:rPr>
+              <w:t>"Either party may terminate this Agreement for convenience upon providing at least thirty (30) days' prior written notice to the other party."</w:t>
             </w:r>
           </w:p>
         </w:tc>

</xml_diff>